<commit_message>
Add Zenodo DOI and ORCID
- Manuscript (BMC and Elsevier versions): archived version is Zenodo DOI
  10.5281/zenodo.23119961 (release2, same code as tag bmc-submission-v3.1), cited in the
  Software block, the data availability statement and the reference list.
- ORCID 0000-0001-5342-1499 in both cover letters, the Elsevier title page and CITATION.cff.
- README: Zenodo badge (all-versions DOI 10.5281/zenodo.23119960).

Co-Authored-By: Claude Opus 5.5 <noreply@anthropic.com>
</commit_message>
<xml_diff>
--- a/submission/cover_letter.docx
+++ b/submission/cover_letter.docx
@@ -26,6 +26,12 @@
       </w:r>
       <w:r>
         <w:t xml:space="preserve">kendiukhov@gmail.com</w:t>
+      </w:r>
+      <w:r>
+        <w:br/>
+      </w:r>
+      <w:r>
+        <w:t xml:space="preserve">ORCID: 0000-0001-5342-1499</w:t>
       </w:r>
     </w:p>
     <w:p>

</xml_diff>

<commit_message>
Cover letters: related-papers paragraph completed
Name the six related papers cited in the manuscript (three published, three preprints), link the
author's Google Scholar profile for the rest, and state that this manuscript has not been
posted as a preprint. READMEs updated: the CBC package was never submitted; BMC is the target.

Co-Authored-By: Claude Opus 5.5 <noreply@anthropic.com>
</commit_message>
<xml_diff>
--- a/submission/cover_letter.docx
+++ b/submission/cover_letter.docx
@@ -237,7 +237,7 @@
         <w:t xml:space="preserve"> </w:t>
       </w:r>
       <w:r>
-        <w:t xml:space="preserve">The study is a secondary analysis of publicly available, de-identified human single-cell data and public models; no new human data were collected, so ethics approval was not required. The use of an AI assistant in coding, reference checking and drafting is described in the Methods and in the declaration of generative AI use, as Elsevier policy requires. Related work by the author on static gene embeddings, attention, residual-stream geometry, the geometry and topology of hidden states and sparse-autoencoder features is cited in the manuscript (six papers). Three of them are published: in</w:t>
+        <w:t xml:space="preserve">The study is a secondary analysis of publicly available, de-identified human single-cell data and public models; no new human data were collected, so ethics approval was not required. The use of an AI assistant in coding, reference checking and drafting is described in the Methods and in the declaration of generative AI use, as Elsevier policy requires. I have written a series of papers on the interpretability and evaluation of single-cell foundation models; the full list is on my Google Scholar profile (https://scholar.google.com/citations?user=zvQylCUAAAAJ). The six closest to this work, on static gene embeddings, attention, residual-stream geometry, the geometry and topology of hidden states and sparse-autoencoder features, are cited in the manuscript. Three of them are published: in</w:t>
       </w:r>
       <w:r>
         <w:t xml:space="preserve"> </w:t>
@@ -285,7 +285,7 @@
         <w:t xml:space="preserve"> </w:t>
       </w:r>
       <w:r>
-        <w:t xml:space="preserve">(doi:10.1371/journal.pone.0344826); the other three are preprints, and the sparse-autoencoder atlas paper also has a Research Square preprint (doi:10.21203/rs.3.rs-9082479/v1). None of them reports the contextual-representation analyses presented here. [Author: state the current status of the sparse-autoencoder atlas paper, and confirm that this manuscript has not been posted as a preprint and is not under consideration at BMC Genomics.]</w:t>
+        <w:t xml:space="preserve">(doi:10.1371/journal.pone.0344826). The other three are preprints on SSRN and arXiv; the sparse-autoencoder atlas paper is also posted on Research Square (doi:10.21203/rs.3.rs-9082479/v1). None of these papers reports the contextual-representation analyses presented here. This manuscript has not been posted as a preprint.</w:t>
       </w:r>
     </w:p>
     <w:p>

</xml_diff>